<commit_message>
fix(#39): make fixed-table tblW equal the sum of colWidths
colWidths=3000,3000,3000 (9000 twips) disagreed with width=9cm (5102 twips);
WPS stretches a fixed table on that disagreement. Use colWidths=1701,1701,1700
(sum 5102) so tblW == ΣcolWidths, regenerate the fixture, and update the
manifest and the #4 research note.
</commit_message>
<xml_diff>
--- a/tests/fixtures/tables/fixed-table.docx
+++ b/tests/fixtures/tables/fixed-table.docx
@@ -23,9 +23,9 @@
         <w:tblLayout w:type="fixed"/>
       </w:tblPr>
       <w:tblGrid>
-        <w:gridCol w:w="3000"/>
-        <w:gridCol w:w="3000"/>
-        <w:gridCol w:w="3000"/>
+        <w:gridCol w:w="1701"/>
+        <w:gridCol w:w="1701"/>
+        <w:gridCol w:w="1700"/>
       </w:tblGrid>
       <w:tr>
         <w:trPr>

</xml_diff>